<commit_message>
doc(l10n_do_accounitng): i dont now wtf claude do but is worked and consumed all my tokens - add script to generate docuemtation with imgs
</commit_message>
<xml_diff>
--- a/doc/doc_usuario_l10n_do_accounting.docx
+++ b/doc/doc_usuario_l10n_do_accounting.docx
@@ -1088,6 +1088,110 @@
     </w:p>
     <w:p>
       <w:pPr>
+        <w:jc w:val="center"/>
+      </w:pPr>
+      <w:r>
+        <w:drawing>
+          <wp:inline xmlns:a="http://schemas.openxmlformats.org/drawingml/2006/main" xmlns:pic="http://schemas.openxmlformats.org/drawingml/2006/picture">
+            <wp:extent cx="5029200" cy="3143250"/>
+            <wp:docPr id="2" name="Picture 2"/>
+            <wp:cNvGraphicFramePr>
+              <a:graphicFrameLocks noChangeAspect="1"/>
+            </wp:cNvGraphicFramePr>
+            <a:graphic>
+              <a:graphicData uri="http://schemas.openxmlformats.org/drawingml/2006/picture">
+                <pic:pic>
+                  <pic:nvPicPr>
+                    <pic:cNvPr id="0" name="02_02_module_install_button.png"/>
+                    <pic:cNvPicPr/>
+                  </pic:nvPicPr>
+                  <pic:blipFill>
+                    <a:blip r:embed="rId9"/>
+                    <a:stretch>
+                      <a:fillRect/>
+                    </a:stretch>
+                  </pic:blipFill>
+                  <pic:spPr>
+                    <a:xfrm>
+                      <a:off x="0" y="0"/>
+                      <a:ext cx="5029200" cy="3143250"/>
+                    </a:xfrm>
+                    <a:prstGeom prst="rect"/>
+                  </pic:spPr>
+                </pic:pic>
+              </a:graphicData>
+            </a:graphic>
+          </wp:inline>
+        </w:drawing>
+      </w:r>
+    </w:p>
+    <w:p>
+      <w:pPr>
+        <w:jc w:val="center"/>
+      </w:pPr>
+      <w:r>
+        <w:rPr>
+          <w:i/>
+          <w:color w:val="707070"/>
+          <w:sz w:val="18"/>
+        </w:rPr>
+        <w:t>Búsqueda del módulo 'Fiscal Accounting (Rep. Dominicana)' en la tienda de aplicaciones</w:t>
+      </w:r>
+    </w:p>
+    <w:p>
+      <w:pPr>
+        <w:jc w:val="center"/>
+      </w:pPr>
+      <w:r>
+        <w:drawing>
+          <wp:inline xmlns:a="http://schemas.openxmlformats.org/drawingml/2006/main" xmlns:pic="http://schemas.openxmlformats.org/drawingml/2006/picture">
+            <wp:extent cx="5029200" cy="3143250"/>
+            <wp:docPr id="1" name="Picture 1"/>
+            <wp:cNvGraphicFramePr>
+              <a:graphicFrameLocks noChangeAspect="1"/>
+            </wp:cNvGraphicFramePr>
+            <a:graphic>
+              <a:graphicData uri="http://schemas.openxmlformats.org/drawingml/2006/picture">
+                <pic:pic>
+                  <pic:nvPicPr>
+                    <pic:cNvPr id="0" name="02_02_module_install_button.png"/>
+                    <pic:cNvPicPr/>
+                  </pic:nvPicPr>
+                  <pic:blipFill>
+                    <a:blip r:embed="rId9"/>
+                    <a:stretch>
+                      <a:fillRect/>
+                    </a:stretch>
+                  </pic:blipFill>
+                  <pic:spPr>
+                    <a:xfrm>
+                      <a:off x="0" y="0"/>
+                      <a:ext cx="5029200" cy="3143250"/>
+                    </a:xfrm>
+                    <a:prstGeom prst="rect"/>
+                  </pic:spPr>
+                </pic:pic>
+              </a:graphicData>
+            </a:graphic>
+          </wp:inline>
+        </w:drawing>
+      </w:r>
+    </w:p>
+    <w:p>
+      <w:pPr>
+        <w:jc w:val="center"/>
+      </w:pPr>
+      <w:r>
+        <w:rPr>
+          <w:i/>
+          <w:color w:val="707070"/>
+          <w:sz w:val="18"/>
+        </w:rPr>
+        <w:t>Módulo instalado — estado confirmado en la tienda de aplicaciones</w:t>
+      </w:r>
+    </w:p>
+    <w:p>
+      <w:pPr>
         <w:pStyle w:val="Heading1"/>
         <w:jc w:val="left"/>
       </w:pPr>
@@ -1235,6 +1339,58 @@
     </w:p>
     <w:p>
       <w:pPr>
+        <w:jc w:val="center"/>
+      </w:pPr>
+      <w:r>
+        <w:drawing>
+          <wp:inline xmlns:a="http://schemas.openxmlformats.org/drawingml/2006/main" xmlns:pic="http://schemas.openxmlformats.org/drawingml/2006/picture">
+            <wp:extent cx="5029200" cy="3143250"/>
+            <wp:docPr id="3" name="Picture 3"/>
+            <wp:cNvGraphicFramePr>
+              <a:graphicFrameLocks noChangeAspect="1"/>
+            </wp:cNvGraphicFramePr>
+            <a:graphic>
+              <a:graphicData uri="http://schemas.openxmlformats.org/drawingml/2006/picture">
+                <pic:pic>
+                  <pic:nvPicPr>
+                    <pic:cNvPr id="0" name="03_01_company_form.png"/>
+                    <pic:cNvPicPr/>
+                  </pic:nvPicPr>
+                  <pic:blipFill>
+                    <a:blip r:embed="rId10"/>
+                    <a:stretch>
+                      <a:fillRect/>
+                    </a:stretch>
+                  </pic:blipFill>
+                  <pic:spPr>
+                    <a:xfrm>
+                      <a:off x="0" y="0"/>
+                      <a:ext cx="5029200" cy="3143250"/>
+                    </a:xfrm>
+                    <a:prstGeom prst="rect"/>
+                  </pic:spPr>
+                </pic:pic>
+              </a:graphicData>
+            </a:graphic>
+          </wp:inline>
+        </w:drawing>
+      </w:r>
+    </w:p>
+    <w:p>
+      <w:pPr>
+        <w:jc w:val="center"/>
+      </w:pPr>
+      <w:r>
+        <w:rPr>
+          <w:i/>
+          <w:color w:val="707070"/>
+          <w:sz w:val="18"/>
+        </w:rPr>
+        <w:t>Formulario de configuración de la compañía con RNC dominicano</w:t>
+      </w:r>
+    </w:p>
+    <w:p>
+      <w:pPr>
         <w:pStyle w:val="Heading2"/>
         <w:jc w:val="left"/>
       </w:pPr>
@@ -1306,6 +1462,58 @@
           <w:sz w:val="19"/>
         </w:rPr>
         <w:t>Si el plan contable ya estaba configurado con anterioridad, no es necesario reinstalarlo. Omitir este paso si las cuentas contables dominicanas ya están presentes en el sistema.</w:t>
+      </w:r>
+    </w:p>
+    <w:p>
+      <w:pPr>
+        <w:jc w:val="center"/>
+      </w:pPr>
+      <w:r>
+        <w:drawing>
+          <wp:inline xmlns:a="http://schemas.openxmlformats.org/drawingml/2006/main" xmlns:pic="http://schemas.openxmlformats.org/drawingml/2006/picture">
+            <wp:extent cx="5029200" cy="3143250"/>
+            <wp:docPr id="4" name="Picture 4"/>
+            <wp:cNvGraphicFramePr>
+              <a:graphicFrameLocks noChangeAspect="1"/>
+            </wp:cNvGraphicFramePr>
+            <a:graphic>
+              <a:graphicData uri="http://schemas.openxmlformats.org/drawingml/2006/picture">
+                <pic:pic>
+                  <pic:nvPicPr>
+                    <pic:cNvPr id="0" name="03_02_accounting_settings_coa.png"/>
+                    <pic:cNvPicPr/>
+                  </pic:nvPicPr>
+                  <pic:blipFill>
+                    <a:blip r:embed="rId11"/>
+                    <a:stretch>
+                      <a:fillRect/>
+                    </a:stretch>
+                  </pic:blipFill>
+                  <pic:spPr>
+                    <a:xfrm>
+                      <a:off x="0" y="0"/>
+                      <a:ext cx="5029200" cy="3143250"/>
+                    </a:xfrm>
+                    <a:prstGeom prst="rect"/>
+                  </pic:spPr>
+                </pic:pic>
+              </a:graphicData>
+            </a:graphic>
+          </wp:inline>
+        </w:drawing>
+      </w:r>
+    </w:p>
+    <w:p>
+      <w:pPr>
+        <w:jc w:val="center"/>
+      </w:pPr>
+      <w:r>
+        <w:rPr>
+          <w:i/>
+          <w:color w:val="707070"/>
+          <w:sz w:val="18"/>
+        </w:rPr>
+        <w:t>Ajustes de Contabilidad mostrando el Plan Contable Dominicano activo</w:t>
       </w:r>
     </w:p>
     <w:p>
@@ -1841,6 +2049,110 @@
     <w:p/>
     <w:p>
       <w:pPr>
+        <w:jc w:val="center"/>
+      </w:pPr>
+      <w:r>
+        <w:drawing>
+          <wp:inline xmlns:a="http://schemas.openxmlformats.org/drawingml/2006/main" xmlns:pic="http://schemas.openxmlformats.org/drawingml/2006/picture">
+            <wp:extent cx="5029200" cy="3143250"/>
+            <wp:docPr id="6" name="Picture 6"/>
+            <wp:cNvGraphicFramePr>
+              <a:graphicFrameLocks noChangeAspect="1"/>
+            </wp:cNvGraphicFramePr>
+            <a:graphic>
+              <a:graphicData uri="http://schemas.openxmlformats.org/drawingml/2006/picture">
+                <pic:pic>
+                  <pic:nvPicPr>
+                    <pic:cNvPr id="0" name="03_03_contact_contribuyente.png"/>
+                    <pic:cNvPicPr/>
+                  </pic:nvPicPr>
+                  <pic:blipFill>
+                    <a:blip r:embed="rId13"/>
+                    <a:stretch>
+                      <a:fillRect/>
+                    </a:stretch>
+                  </pic:blipFill>
+                  <pic:spPr>
+                    <a:xfrm>
+                      <a:off x="0" y="0"/>
+                      <a:ext cx="5029200" cy="3143250"/>
+                    </a:xfrm>
+                    <a:prstGeom prst="rect"/>
+                  </pic:spPr>
+                </pic:pic>
+              </a:graphicData>
+            </a:graphic>
+          </wp:inline>
+        </w:drawing>
+      </w:r>
+    </w:p>
+    <w:p>
+      <w:pPr>
+        <w:jc w:val="center"/>
+      </w:pPr>
+      <w:r>
+        <w:rPr>
+          <w:i/>
+          <w:color w:val="707070"/>
+          <w:sz w:val="18"/>
+        </w:rPr>
+        <w:t>Contacto tipo Contribuyente Fiscal con RNC de 9 dígitos y tipo calculado automáticamente</w:t>
+      </w:r>
+    </w:p>
+    <w:p>
+      <w:pPr>
+        <w:jc w:val="center"/>
+      </w:pPr>
+      <w:r>
+        <w:drawing>
+          <wp:inline xmlns:a="http://schemas.openxmlformats.org/drawingml/2006/main" xmlns:pic="http://schemas.openxmlformats.org/drawingml/2006/picture">
+            <wp:extent cx="5029200" cy="3143250"/>
+            <wp:docPr id="5" name="Picture 5"/>
+            <wp:cNvGraphicFramePr>
+              <a:graphicFrameLocks noChangeAspect="1"/>
+            </wp:cNvGraphicFramePr>
+            <a:graphic>
+              <a:graphicData uri="http://schemas.openxmlformats.org/drawingml/2006/picture">
+                <pic:pic>
+                  <pic:nvPicPr>
+                    <pic:cNvPr id="0" name="03_03_contact_persona_fisica.png"/>
+                    <pic:cNvPicPr/>
+                  </pic:nvPicPr>
+                  <pic:blipFill>
+                    <a:blip r:embed="rId12"/>
+                    <a:stretch>
+                      <a:fillRect/>
+                    </a:stretch>
+                  </pic:blipFill>
+                  <pic:spPr>
+                    <a:xfrm>
+                      <a:off x="0" y="0"/>
+                      <a:ext cx="5029200" cy="3143250"/>
+                    </a:xfrm>
+                    <a:prstGeom prst="rect"/>
+                  </pic:spPr>
+                </pic:pic>
+              </a:graphicData>
+            </a:graphic>
+          </wp:inline>
+        </w:drawing>
+      </w:r>
+    </w:p>
+    <w:p>
+      <w:pPr>
+        <w:jc w:val="center"/>
+      </w:pPr>
+      <w:r>
+        <w:rPr>
+          <w:i/>
+          <w:color w:val="707070"/>
+          <w:sz w:val="18"/>
+        </w:rPr>
+        <w:t>Contacto tipo Persona Física con cédula de 11 dígitos</w:t>
+      </w:r>
+    </w:p>
+    <w:p>
+      <w:pPr>
         <w:pStyle w:val="Heading2"/>
         <w:jc w:val="left"/>
       </w:pPr>
@@ -2508,6 +2820,162 @@
     </w:p>
     <w:p>
       <w:pPr>
+        <w:jc w:val="center"/>
+      </w:pPr>
+      <w:r>
+        <w:drawing>
+          <wp:inline xmlns:a="http://schemas.openxmlformats.org/drawingml/2006/main" xmlns:pic="http://schemas.openxmlformats.org/drawingml/2006/picture">
+            <wp:extent cx="5029200" cy="3143250"/>
+            <wp:docPr id="9" name="Picture 9"/>
+            <wp:cNvGraphicFramePr>
+              <a:graphicFrameLocks noChangeAspect="1"/>
+            </wp:cNvGraphicFramePr>
+            <a:graphic>
+              <a:graphicData uri="http://schemas.openxmlformats.org/drawingml/2006/picture">
+                <pic:pic>
+                  <pic:nvPicPr>
+                    <pic:cNvPr id="0" name="03_04_ncf_batch_form.png"/>
+                    <pic:cNvPicPr/>
+                  </pic:nvPicPr>
+                  <pic:blipFill>
+                    <a:blip r:embed="rId14"/>
+                    <a:stretch>
+                      <a:fillRect/>
+                    </a:stretch>
+                  </pic:blipFill>
+                  <pic:spPr>
+                    <a:xfrm>
+                      <a:off x="0" y="0"/>
+                      <a:ext cx="5029200" cy="3143250"/>
+                    </a:xfrm>
+                    <a:prstGeom prst="rect"/>
+                  </pic:spPr>
+                </pic:pic>
+              </a:graphicData>
+            </a:graphic>
+          </wp:inline>
+        </w:drawing>
+      </w:r>
+    </w:p>
+    <w:p>
+      <w:pPr>
+        <w:jc w:val="center"/>
+      </w:pPr>
+      <w:r>
+        <w:rPr>
+          <w:i/>
+          <w:color w:val="707070"/>
+          <w:sz w:val="18"/>
+        </w:rPr>
+        <w:t>Diario de Ventas con la opción 'Usar documentos' activada</w:t>
+      </w:r>
+    </w:p>
+    <w:p>
+      <w:pPr>
+        <w:jc w:val="center"/>
+      </w:pPr>
+      <w:r>
+        <w:drawing>
+          <wp:inline xmlns:a="http://schemas.openxmlformats.org/drawingml/2006/main" xmlns:pic="http://schemas.openxmlformats.org/drawingml/2006/picture">
+            <wp:extent cx="5029200" cy="3143250"/>
+            <wp:docPr id="8" name="Picture 8"/>
+            <wp:cNvGraphicFramePr>
+              <a:graphicFrameLocks noChangeAspect="1"/>
+            </wp:cNvGraphicFramePr>
+            <a:graphic>
+              <a:graphicData uri="http://schemas.openxmlformats.org/drawingml/2006/picture">
+                <pic:pic>
+                  <pic:nvPicPr>
+                    <pic:cNvPr id="0" name="03_04_ncf_batch_form.png"/>
+                    <pic:cNvPicPr/>
+                  </pic:nvPicPr>
+                  <pic:blipFill>
+                    <a:blip r:embed="rId14"/>
+                    <a:stretch>
+                      <a:fillRect/>
+                    </a:stretch>
+                  </pic:blipFill>
+                  <pic:spPr>
+                    <a:xfrm>
+                      <a:off x="0" y="0"/>
+                      <a:ext cx="5029200" cy="3143250"/>
+                    </a:xfrm>
+                    <a:prstGeom prst="rect"/>
+                  </pic:spPr>
+                </pic:pic>
+              </a:graphicData>
+            </a:graphic>
+          </wp:inline>
+        </w:drawing>
+      </w:r>
+    </w:p>
+    <w:p>
+      <w:pPr>
+        <w:jc w:val="center"/>
+      </w:pPr>
+      <w:r>
+        <w:rPr>
+          <w:i/>
+          <w:color w:val="707070"/>
+          <w:sz w:val="18"/>
+        </w:rPr>
+        <w:t>Pestaña 'Tipos de Documento' mostrando los tipos de comprobante disponibles</w:t>
+      </w:r>
+    </w:p>
+    <w:p>
+      <w:pPr>
+        <w:jc w:val="center"/>
+      </w:pPr>
+      <w:r>
+        <w:drawing>
+          <wp:inline xmlns:a="http://schemas.openxmlformats.org/drawingml/2006/main" xmlns:pic="http://schemas.openxmlformats.org/drawingml/2006/picture">
+            <wp:extent cx="5029200" cy="3143250"/>
+            <wp:docPr id="7" name="Picture 7"/>
+            <wp:cNvGraphicFramePr>
+              <a:graphicFrameLocks noChangeAspect="1"/>
+            </wp:cNvGraphicFramePr>
+            <a:graphic>
+              <a:graphicData uri="http://schemas.openxmlformats.org/drawingml/2006/picture">
+                <pic:pic>
+                  <pic:nvPicPr>
+                    <pic:cNvPr id="0" name="03_04_ncf_batch_form.png"/>
+                    <pic:cNvPicPr/>
+                  </pic:nvPicPr>
+                  <pic:blipFill>
+                    <a:blip r:embed="rId14"/>
+                    <a:stretch>
+                      <a:fillRect/>
+                    </a:stretch>
+                  </pic:blipFill>
+                  <pic:spPr>
+                    <a:xfrm>
+                      <a:off x="0" y="0"/>
+                      <a:ext cx="5029200" cy="3143250"/>
+                    </a:xfrm>
+                    <a:prstGeom prst="rect"/>
+                  </pic:spPr>
+                </pic:pic>
+              </a:graphicData>
+            </a:graphic>
+          </wp:inline>
+        </w:drawing>
+      </w:r>
+    </w:p>
+    <w:p>
+      <w:pPr>
+        <w:jc w:val="center"/>
+      </w:pPr>
+      <w:r>
+        <w:rPr>
+          <w:i/>
+          <w:color w:val="707070"/>
+          <w:sz w:val="18"/>
+        </w:rPr>
+        <w:t>Formulario de un Lote NCF con rango de secuencias y fechas de vigencia</w:t>
+      </w:r>
+    </w:p>
+    <w:p>
+      <w:pPr>
         <w:pStyle w:val="Heading1"/>
         <w:jc w:val="left"/>
       </w:pPr>
@@ -2878,6 +3346,162 @@
     <w:p/>
     <w:p>
       <w:pPr>
+        <w:jc w:val="center"/>
+      </w:pPr>
+      <w:r>
+        <w:drawing>
+          <wp:inline xmlns:a="http://schemas.openxmlformats.org/drawingml/2006/main" xmlns:pic="http://schemas.openxmlformats.org/drawingml/2006/picture">
+            <wp:extent cx="5029200" cy="3143250"/>
+            <wp:docPr id="12" name="Picture 12"/>
+            <wp:cNvGraphicFramePr>
+              <a:graphicFrameLocks noChangeAspect="1"/>
+            </wp:cNvGraphicFramePr>
+            <a:graphic>
+              <a:graphicData uri="http://schemas.openxmlformats.org/drawingml/2006/picture">
+                <pic:pic>
+                  <pic:nvPicPr>
+                    <pic:cNvPr id="0" name="04_02_invoice_draft_with_line.png"/>
+                    <pic:cNvPicPr/>
+                  </pic:nvPicPr>
+                  <pic:blipFill>
+                    <a:blip r:embed="rId16"/>
+                    <a:stretch>
+                      <a:fillRect/>
+                    </a:stretch>
+                  </pic:blipFill>
+                  <pic:spPr>
+                    <a:xfrm>
+                      <a:off x="0" y="0"/>
+                      <a:ext cx="5029200" cy="3143250"/>
+                    </a:xfrm>
+                    <a:prstGeom prst="rect"/>
+                  </pic:spPr>
+                </pic:pic>
+              </a:graphicData>
+            </a:graphic>
+          </wp:inline>
+        </w:drawing>
+      </w:r>
+    </w:p>
+    <w:p>
+      <w:pPr>
+        <w:jc w:val="center"/>
+      </w:pPr>
+      <w:r>
+        <w:rPr>
+          <w:i/>
+          <w:color w:val="707070"/>
+          <w:sz w:val="18"/>
+        </w:rPr>
+        <w:t>Nueva factura de venta con cliente seleccionado y tipo de documento asignado automáticamente</w:t>
+      </w:r>
+    </w:p>
+    <w:p>
+      <w:pPr>
+        <w:jc w:val="center"/>
+      </w:pPr>
+      <w:r>
+        <w:drawing>
+          <wp:inline xmlns:a="http://schemas.openxmlformats.org/drawingml/2006/main" xmlns:pic="http://schemas.openxmlformats.org/drawingml/2006/picture">
+            <wp:extent cx="5029200" cy="3143250"/>
+            <wp:docPr id="11" name="Picture 11"/>
+            <wp:cNvGraphicFramePr>
+              <a:graphicFrameLocks noChangeAspect="1"/>
+            </wp:cNvGraphicFramePr>
+            <a:graphic>
+              <a:graphicData uri="http://schemas.openxmlformats.org/drawingml/2006/picture">
+                <pic:pic>
+                  <pic:nvPicPr>
+                    <pic:cNvPr id="0" name="04_02_invoice_draft_with_line.png"/>
+                    <pic:cNvPicPr/>
+                  </pic:nvPicPr>
+                  <pic:blipFill>
+                    <a:blip r:embed="rId16"/>
+                    <a:stretch>
+                      <a:fillRect/>
+                    </a:stretch>
+                  </pic:blipFill>
+                  <pic:spPr>
+                    <a:xfrm>
+                      <a:off x="0" y="0"/>
+                      <a:ext cx="5029200" cy="3143250"/>
+                    </a:xfrm>
+                    <a:prstGeom prst="rect"/>
+                  </pic:spPr>
+                </pic:pic>
+              </a:graphicData>
+            </a:graphic>
+          </wp:inline>
+        </w:drawing>
+      </w:r>
+    </w:p>
+    <w:p>
+      <w:pPr>
+        <w:jc w:val="center"/>
+      </w:pPr>
+      <w:r>
+        <w:rPr>
+          <w:i/>
+          <w:color w:val="707070"/>
+          <w:sz w:val="18"/>
+        </w:rPr>
+        <w:t>Factura en estado borrador con línea de producto e ITBIS calculado</w:t>
+      </w:r>
+    </w:p>
+    <w:p>
+      <w:pPr>
+        <w:jc w:val="center"/>
+      </w:pPr>
+      <w:r>
+        <w:drawing>
+          <wp:inline xmlns:a="http://schemas.openxmlformats.org/drawingml/2006/main" xmlns:pic="http://schemas.openxmlformats.org/drawingml/2006/picture">
+            <wp:extent cx="5029200" cy="3143250"/>
+            <wp:docPr id="10" name="Picture 10"/>
+            <wp:cNvGraphicFramePr>
+              <a:graphicFrameLocks noChangeAspect="1"/>
+            </wp:cNvGraphicFramePr>
+            <a:graphic>
+              <a:graphicData uri="http://schemas.openxmlformats.org/drawingml/2006/picture">
+                <pic:pic>
+                  <pic:nvPicPr>
+                    <pic:cNvPr id="0" name="04_03_invoice_confirmed_with_ncf.png"/>
+                    <pic:cNvPicPr/>
+                  </pic:nvPicPr>
+                  <pic:blipFill>
+                    <a:blip r:embed="rId15"/>
+                    <a:stretch>
+                      <a:fillRect/>
+                    </a:stretch>
+                  </pic:blipFill>
+                  <pic:spPr>
+                    <a:xfrm>
+                      <a:off x="0" y="0"/>
+                      <a:ext cx="5029200" cy="3143250"/>
+                    </a:xfrm>
+                    <a:prstGeom prst="rect"/>
+                  </pic:spPr>
+                </pic:pic>
+              </a:graphicData>
+            </a:graphic>
+          </wp:inline>
+        </w:drawing>
+      </w:r>
+    </w:p>
+    <w:p>
+      <w:pPr>
+        <w:jc w:val="center"/>
+      </w:pPr>
+      <w:r>
+        <w:rPr>
+          <w:i/>
+          <w:color w:val="707070"/>
+          <w:sz w:val="18"/>
+        </w:rPr>
+        <w:t>Factura confirmada con el Número de Comprobante Fiscal (NCF) asignado automáticamente</w:t>
+      </w:r>
+    </w:p>
+    <w:p>
+      <w:pPr>
         <w:pStyle w:val="Heading1"/>
         <w:jc w:val="left"/>
       </w:pPr>
@@ -3015,6 +3639,58 @@
     </w:p>
     <w:p>
       <w:pPr>
+        <w:jc w:val="center"/>
+      </w:pPr>
+      <w:r>
+        <w:drawing>
+          <wp:inline xmlns:a="http://schemas.openxmlformats.org/drawingml/2006/main" xmlns:pic="http://schemas.openxmlformats.org/drawingml/2006/picture">
+            <wp:extent cx="5029200" cy="3143250"/>
+            <wp:docPr id="13" name="Picture 13"/>
+            <wp:cNvGraphicFramePr>
+              <a:graphicFrameLocks noChangeAspect="1"/>
+            </wp:cNvGraphicFramePr>
+            <a:graphic>
+              <a:graphicData uri="http://schemas.openxmlformats.org/drawingml/2006/picture">
+                <pic:pic>
+                  <pic:nvPicPr>
+                    <pic:cNvPr id="0" name="05_A_vendor_bill_contribuyente_ncf_field.png"/>
+                    <pic:cNvPicPr/>
+                  </pic:nvPicPr>
+                  <pic:blipFill>
+                    <a:blip r:embed="rId17"/>
+                    <a:stretch>
+                      <a:fillRect/>
+                    </a:stretch>
+                  </pic:blipFill>
+                  <pic:spPr>
+                    <a:xfrm>
+                      <a:off x="0" y="0"/>
+                      <a:ext cx="5029200" cy="3143250"/>
+                    </a:xfrm>
+                    <a:prstGeom prst="rect"/>
+                  </pic:spPr>
+                </pic:pic>
+              </a:graphicData>
+            </a:graphic>
+          </wp:inline>
+        </w:drawing>
+      </w:r>
+    </w:p>
+    <w:p>
+      <w:pPr>
+        <w:jc w:val="center"/>
+      </w:pPr>
+      <w:r>
+        <w:rPr>
+          <w:i/>
+          <w:color w:val="707070"/>
+          <w:sz w:val="18"/>
+        </w:rPr>
+        <w:t>Factura de compra de proveedor con RNC — campo NCF habilitado para ingreso manual</w:t>
+      </w:r>
+    </w:p>
+    <w:p>
+      <w:pPr>
         <w:pStyle w:val="Heading2"/>
         <w:jc w:val="left"/>
       </w:pPr>
@@ -3092,6 +3768,58 @@
       </w:pPr>
       <w:r>
         <w:t>Hacer clic en "Confirmar". El sistema asignará el NCF automáticamente.</w:t>
+      </w:r>
+    </w:p>
+    <w:p>
+      <w:pPr>
+        <w:jc w:val="center"/>
+      </w:pPr>
+      <w:r>
+        <w:drawing>
+          <wp:inline xmlns:a="http://schemas.openxmlformats.org/drawingml/2006/main" xmlns:pic="http://schemas.openxmlformats.org/drawingml/2006/picture">
+            <wp:extent cx="5029200" cy="3143250"/>
+            <wp:docPr id="14" name="Picture 14"/>
+            <wp:cNvGraphicFramePr>
+              <a:graphicFrameLocks noChangeAspect="1"/>
+            </wp:cNvGraphicFramePr>
+            <a:graphic>
+              <a:graphicData uri="http://schemas.openxmlformats.org/drawingml/2006/picture">
+                <pic:pic>
+                  <pic:nvPicPr>
+                    <pic:cNvPr id="0" name="05_A_vendor_bill_contribuyente_ncf_field.png"/>
+                    <pic:cNvPicPr/>
+                  </pic:nvPicPr>
+                  <pic:blipFill>
+                    <a:blip r:embed="rId17"/>
+                    <a:stretch>
+                      <a:fillRect/>
+                    </a:stretch>
+                  </pic:blipFill>
+                  <pic:spPr>
+                    <a:xfrm>
+                      <a:off x="0" y="0"/>
+                      <a:ext cx="5029200" cy="3143250"/>
+                    </a:xfrm>
+                    <a:prstGeom prst="rect"/>
+                  </pic:spPr>
+                </pic:pic>
+              </a:graphicData>
+            </a:graphic>
+          </wp:inline>
+        </w:drawing>
+      </w:r>
+    </w:p>
+    <w:p>
+      <w:pPr>
+        <w:jc w:val="center"/>
+      </w:pPr>
+      <w:r>
+        <w:rPr>
+          <w:i/>
+          <w:color w:val="707070"/>
+          <w:sz w:val="18"/>
+        </w:rPr>
+        <w:t>Factura de compra de proveedor informal — tipo B11 seleccionado automáticamente, NCF bloqueado</w:t>
       </w:r>
     </w:p>
     <w:p>
@@ -4177,6 +4905,110 @@
     <w:p/>
     <w:p>
       <w:pPr>
+        <w:jc w:val="center"/>
+      </w:pPr>
+      <w:r>
+        <w:drawing>
+          <wp:inline xmlns:a="http://schemas.openxmlformats.org/drawingml/2006/main" xmlns:pic="http://schemas.openxmlformats.org/drawingml/2006/picture">
+            <wp:extent cx="5029200" cy="3143250"/>
+            <wp:docPr id="16" name="Picture 16"/>
+            <wp:cNvGraphicFramePr>
+              <a:graphicFrameLocks noChangeAspect="1"/>
+            </wp:cNvGraphicFramePr>
+            <a:graphic>
+              <a:graphicData uri="http://schemas.openxmlformats.org/drawingml/2006/picture">
+                <pic:pic>
+                  <pic:nvPicPr>
+                    <pic:cNvPr id="0" name="06_01_invoice_for_credit_note.png"/>
+                    <pic:cNvPicPr/>
+                  </pic:nvPicPr>
+                  <pic:blipFill>
+                    <a:blip r:embed="rId19"/>
+                    <a:stretch>
+                      <a:fillRect/>
+                    </a:stretch>
+                  </pic:blipFill>
+                  <pic:spPr>
+                    <a:xfrm>
+                      <a:off x="0" y="0"/>
+                      <a:ext cx="5029200" cy="3143250"/>
+                    </a:xfrm>
+                    <a:prstGeom prst="rect"/>
+                  </pic:spPr>
+                </pic:pic>
+              </a:graphicData>
+            </a:graphic>
+          </wp:inline>
+        </w:drawing>
+      </w:r>
+    </w:p>
+    <w:p>
+      <w:pPr>
+        <w:jc w:val="center"/>
+      </w:pPr>
+      <w:r>
+        <w:rPr>
+          <w:i/>
+          <w:color w:val="707070"/>
+          <w:sz w:val="18"/>
+        </w:rPr>
+        <w:t>Factura publicada desde la cual se emitirá la nota de crédito</w:t>
+      </w:r>
+    </w:p>
+    <w:p>
+      <w:pPr>
+        <w:jc w:val="center"/>
+      </w:pPr>
+      <w:r>
+        <w:drawing>
+          <wp:inline xmlns:a="http://schemas.openxmlformats.org/drawingml/2006/main" xmlns:pic="http://schemas.openxmlformats.org/drawingml/2006/picture">
+            <wp:extent cx="5029200" cy="3143250"/>
+            <wp:docPr id="15" name="Picture 15"/>
+            <wp:cNvGraphicFramePr>
+              <a:graphicFrameLocks noChangeAspect="1"/>
+            </wp:cNvGraphicFramePr>
+            <a:graphic>
+              <a:graphicData uri="http://schemas.openxmlformats.org/drawingml/2006/picture">
+                <pic:pic>
+                  <pic:nvPicPr>
+                    <pic:cNvPr id="0" name="06_02_credit_note_dialog.png"/>
+                    <pic:cNvPicPr/>
+                  </pic:nvPicPr>
+                  <pic:blipFill>
+                    <a:blip r:embed="rId18"/>
+                    <a:stretch>
+                      <a:fillRect/>
+                    </a:stretch>
+                  </pic:blipFill>
+                  <pic:spPr>
+                    <a:xfrm>
+                      <a:off x="0" y="0"/>
+                      <a:ext cx="5029200" cy="3143250"/>
+                    </a:xfrm>
+                    <a:prstGeom prst="rect"/>
+                  </pic:spPr>
+                </pic:pic>
+              </a:graphicData>
+            </a:graphic>
+          </wp:inline>
+        </w:drawing>
+      </w:r>
+    </w:p>
+    <w:p>
+      <w:pPr>
+        <w:jc w:val="center"/>
+      </w:pPr>
+      <w:r>
+        <w:rPr>
+          <w:i/>
+          <w:color w:val="707070"/>
+          <w:sz w:val="18"/>
+        </w:rPr>
+        <w:t>Diálogo de creación de nota de crédito con campos de motivo y método</w:t>
+      </w:r>
+    </w:p>
+    <w:p>
+      <w:pPr>
         <w:pStyle w:val="Heading1"/>
         <w:jc w:val="left"/>
       </w:pPr>
@@ -4951,6 +5783,58 @@
     </w:p>
     <w:p>
       <w:pPr>
+        <w:jc w:val="center"/>
+      </w:pPr>
+      <w:r>
+        <w:drawing>
+          <wp:inline xmlns:a="http://schemas.openxmlformats.org/drawingml/2006/main" xmlns:pic="http://schemas.openxmlformats.org/drawingml/2006/picture">
+            <wp:extent cx="5029200" cy="3143250"/>
+            <wp:docPr id="17" name="Picture 17"/>
+            <wp:cNvGraphicFramePr>
+              <a:graphicFrameLocks noChangeAspect="1"/>
+            </wp:cNvGraphicFramePr>
+            <a:graphic>
+              <a:graphicData uri="http://schemas.openxmlformats.org/drawingml/2006/picture">
+                <pic:pic>
+                  <pic:nvPicPr>
+                    <pic:cNvPr id="0" name="08_01_cancel_dialog.png"/>
+                    <pic:cNvPicPr/>
+                  </pic:nvPicPr>
+                  <pic:blipFill>
+                    <a:blip r:embed="rId20"/>
+                    <a:stretch>
+                      <a:fillRect/>
+                    </a:stretch>
+                  </pic:blipFill>
+                  <pic:spPr>
+                    <a:xfrm>
+                      <a:off x="0" y="0"/>
+                      <a:ext cx="5029200" cy="3143250"/>
+                    </a:xfrm>
+                    <a:prstGeom prst="rect"/>
+                  </pic:spPr>
+                </pic:pic>
+              </a:graphicData>
+            </a:graphic>
+          </wp:inline>
+        </w:drawing>
+      </w:r>
+    </w:p>
+    <w:p>
+      <w:pPr>
+        <w:jc w:val="center"/>
+      </w:pPr>
+      <w:r>
+        <w:rPr>
+          <w:i/>
+          <w:color w:val="707070"/>
+          <w:sz w:val="18"/>
+        </w:rPr>
+        <w:t>Diálogo de cancelación con selección del Tipo de Anulación DGII</w:t>
+      </w:r>
+    </w:p>
+    <w:p>
+      <w:pPr>
         <w:pStyle w:val="Heading1"/>
         <w:jc w:val="left"/>
       </w:pPr>
@@ -5225,6 +6109,110 @@
     <w:p/>
     <w:p>
       <w:pPr>
+        <w:jc w:val="center"/>
+      </w:pPr>
+      <w:r>
+        <w:drawing>
+          <wp:inline xmlns:a="http://schemas.openxmlformats.org/drawingml/2006/main" xmlns:pic="http://schemas.openxmlformats.org/drawingml/2006/picture">
+            <wp:extent cx="5029200" cy="3143250"/>
+            <wp:docPr id="19" name="Picture 19"/>
+            <wp:cNvGraphicFramePr>
+              <a:graphicFrameLocks noChangeAspect="1"/>
+            </wp:cNvGraphicFramePr>
+            <a:graphic>
+              <a:graphicData uri="http://schemas.openxmlformats.org/drawingml/2006/picture">
+                <pic:pic>
+                  <pic:nvPicPr>
+                    <pic:cNvPr id="0" name="03_03_contact_contribuyente.png"/>
+                    <pic:cNvPicPr/>
+                  </pic:nvPicPr>
+                  <pic:blipFill>
+                    <a:blip r:embed="rId13"/>
+                    <a:stretch>
+                      <a:fillRect/>
+                    </a:stretch>
+                  </pic:blipFill>
+                  <pic:spPr>
+                    <a:xfrm>
+                      <a:off x="0" y="0"/>
+                      <a:ext cx="5029200" cy="3143250"/>
+                    </a:xfrm>
+                    <a:prstGeom prst="rect"/>
+                  </pic:spPr>
+                </pic:pic>
+              </a:graphicData>
+            </a:graphic>
+          </wp:inline>
+        </w:drawing>
+      </w:r>
+    </w:p>
+    <w:p>
+      <w:pPr>
+        <w:jc w:val="center"/>
+      </w:pPr>
+      <w:r>
+        <w:rPr>
+          <w:i/>
+          <w:color w:val="707070"/>
+          <w:sz w:val="18"/>
+        </w:rPr>
+        <w:t>Detalle de un Lote NCF con secuencias usadas, disponibles y estado</w:t>
+      </w:r>
+    </w:p>
+    <w:p>
+      <w:pPr>
+        <w:jc w:val="center"/>
+      </w:pPr>
+      <w:r>
+        <w:drawing>
+          <wp:inline xmlns:a="http://schemas.openxmlformats.org/drawingml/2006/main" xmlns:pic="http://schemas.openxmlformats.org/drawingml/2006/picture">
+            <wp:extent cx="5029200" cy="3143250"/>
+            <wp:docPr id="18" name="Picture 18"/>
+            <wp:cNvGraphicFramePr>
+              <a:graphicFrameLocks noChangeAspect="1"/>
+            </wp:cNvGraphicFramePr>
+            <a:graphic>
+              <a:graphicData uri="http://schemas.openxmlformats.org/drawingml/2006/picture">
+                <pic:pic>
+                  <pic:nvPicPr>
+                    <pic:cNvPr id="0" name="09_02_ncf_batch_list_all.png"/>
+                    <pic:cNvPicPr/>
+                  </pic:nvPicPr>
+                  <pic:blipFill>
+                    <a:blip r:embed="rId21"/>
+                    <a:stretch>
+                      <a:fillRect/>
+                    </a:stretch>
+                  </pic:blipFill>
+                  <pic:spPr>
+                    <a:xfrm>
+                      <a:off x="0" y="0"/>
+                      <a:ext cx="5029200" cy="3143250"/>
+                    </a:xfrm>
+                    <a:prstGeom prst="rect"/>
+                  </pic:spPr>
+                </pic:pic>
+              </a:graphicData>
+            </a:graphic>
+          </wp:inline>
+        </w:drawing>
+      </w:r>
+    </w:p>
+    <w:p>
+      <w:pPr>
+        <w:jc w:val="center"/>
+      </w:pPr>
+      <w:r>
+        <w:rPr>
+          <w:i/>
+          <w:color w:val="707070"/>
+          <w:sz w:val="18"/>
+        </w:rPr>
+        <w:t>Lista de todos los lotes NCF con su estado actual</w:t>
+      </w:r>
+    </w:p>
+    <w:p>
+      <w:pPr>
         <w:pStyle w:val="Heading2"/>
         <w:jc w:val="left"/>
       </w:pPr>
@@ -5676,6 +6664,58 @@
       </w:pPr>
       <w:r>
         <w:t>NCF de origen en notas de crédito y débito.</w:t>
+      </w:r>
+    </w:p>
+    <w:p>
+      <w:pPr>
+        <w:jc w:val="center"/>
+      </w:pPr>
+      <w:r>
+        <w:drawing>
+          <wp:inline xmlns:a="http://schemas.openxmlformats.org/drawingml/2006/main" xmlns:pic="http://schemas.openxmlformats.org/drawingml/2006/picture">
+            <wp:extent cx="5029200" cy="3143250"/>
+            <wp:docPr id="20" name="Picture 20"/>
+            <wp:cNvGraphicFramePr>
+              <a:graphicFrameLocks noChangeAspect="1"/>
+            </wp:cNvGraphicFramePr>
+            <a:graphic>
+              <a:graphicData uri="http://schemas.openxmlformats.org/drawingml/2006/picture">
+                <pic:pic>
+                  <pic:nvPicPr>
+                    <pic:cNvPr id="0" name="11_01_send_print_dialog.png"/>
+                    <pic:cNvPicPr/>
+                  </pic:nvPicPr>
+                  <pic:blipFill>
+                    <a:blip r:embed="rId22"/>
+                    <a:stretch>
+                      <a:fillRect/>
+                    </a:stretch>
+                  </pic:blipFill>
+                  <pic:spPr>
+                    <a:xfrm>
+                      <a:off x="0" y="0"/>
+                      <a:ext cx="5029200" cy="3143250"/>
+                    </a:xfrm>
+                    <a:prstGeom prst="rect"/>
+                  </pic:spPr>
+                </pic:pic>
+              </a:graphicData>
+            </a:graphic>
+          </wp:inline>
+        </w:drawing>
+      </w:r>
+    </w:p>
+    <w:p>
+      <w:pPr>
+        <w:jc w:val="center"/>
+      </w:pPr>
+      <w:r>
+        <w:rPr>
+          <w:i/>
+          <w:color w:val="707070"/>
+          <w:sz w:val="18"/>
+        </w:rPr>
+        <w:t>Opciones de envío e impresión de la factura fiscal</w:t>
       </w:r>
     </w:p>
     <w:p>
@@ -5972,6 +7012,110 @@
           <w:sz w:val="19"/>
         </w:rPr>
         <w:t>Por defecto, solo los usuarios con el rol de Administrador tienen asignados todos estos permisos. Se recomienda asignarlos de manera individual y controlada según las responsabilidades de cada usuario.</w:t>
+      </w:r>
+    </w:p>
+    <w:p>
+      <w:pPr>
+        <w:jc w:val="center"/>
+      </w:pPr>
+      <w:r>
+        <w:drawing>
+          <wp:inline xmlns:a="http://schemas.openxmlformats.org/drawingml/2006/main" xmlns:pic="http://schemas.openxmlformats.org/drawingml/2006/picture">
+            <wp:extent cx="5029200" cy="3143250"/>
+            <wp:docPr id="22" name="Picture 22"/>
+            <wp:cNvGraphicFramePr>
+              <a:graphicFrameLocks noChangeAspect="1"/>
+            </wp:cNvGraphicFramePr>
+            <a:graphic>
+              <a:graphicData uri="http://schemas.openxmlformats.org/drawingml/2006/picture">
+                <pic:pic>
+                  <pic:nvPicPr>
+                    <pic:cNvPr id="0" name="12_01_users_list.png"/>
+                    <pic:cNvPicPr/>
+                  </pic:nvPicPr>
+                  <pic:blipFill>
+                    <a:blip r:embed="rId24"/>
+                    <a:stretch>
+                      <a:fillRect/>
+                    </a:stretch>
+                  </pic:blipFill>
+                  <pic:spPr>
+                    <a:xfrm>
+                      <a:off x="0" y="0"/>
+                      <a:ext cx="5029200" cy="3143250"/>
+                    </a:xfrm>
+                    <a:prstGeom prst="rect"/>
+                  </pic:spPr>
+                </pic:pic>
+              </a:graphicData>
+            </a:graphic>
+          </wp:inline>
+        </w:drawing>
+      </w:r>
+    </w:p>
+    <w:p>
+      <w:pPr>
+        <w:jc w:val="center"/>
+      </w:pPr>
+      <w:r>
+        <w:rPr>
+          <w:i/>
+          <w:color w:val="707070"/>
+          <w:sz w:val="18"/>
+        </w:rPr>
+        <w:t>Lista de usuarios del sistema</w:t>
+      </w:r>
+    </w:p>
+    <w:p>
+      <w:pPr>
+        <w:jc w:val="center"/>
+      </w:pPr>
+      <w:r>
+        <w:drawing>
+          <wp:inline xmlns:a="http://schemas.openxmlformats.org/drawingml/2006/main" xmlns:pic="http://schemas.openxmlformats.org/drawingml/2006/picture">
+            <wp:extent cx="5029200" cy="3143250"/>
+            <wp:docPr id="21" name="Picture 21"/>
+            <wp:cNvGraphicFramePr>
+              <a:graphicFrameLocks noChangeAspect="1"/>
+            </wp:cNvGraphicFramePr>
+            <a:graphic>
+              <a:graphicData uri="http://schemas.openxmlformats.org/drawingml/2006/picture">
+                <pic:pic>
+                  <pic:nvPicPr>
+                    <pic:cNvPr id="0" name="12_02_user_form_permissions.png"/>
+                    <pic:cNvPicPr/>
+                  </pic:nvPicPr>
+                  <pic:blipFill>
+                    <a:blip r:embed="rId23"/>
+                    <a:stretch>
+                      <a:fillRect/>
+                    </a:stretch>
+                  </pic:blipFill>
+                  <pic:spPr>
+                    <a:xfrm>
+                      <a:off x="0" y="0"/>
+                      <a:ext cx="5029200" cy="3143250"/>
+                    </a:xfrm>
+                    <a:prstGeom prst="rect"/>
+                  </pic:spPr>
+                </pic:pic>
+              </a:graphicData>
+            </a:graphic>
+          </wp:inline>
+        </w:drawing>
+      </w:r>
+    </w:p>
+    <w:p>
+      <w:pPr>
+        <w:jc w:val="center"/>
+      </w:pPr>
+      <w:r>
+        <w:rPr>
+          <w:i/>
+          <w:color w:val="707070"/>
+          <w:sz w:val="18"/>
+        </w:rPr>
+        <w:t>Formulario de usuario mostrando los permisos fiscales disponibles</w:t>
       </w:r>
     </w:p>
     <w:p>

</xml_diff>